<commit_message>
feat: add comprehensive document build scripts and update ignore rules for project documentation
</commit_message>
<xml_diff>
--- a/Document/01_Official_NRDC_Application_Form.docx
+++ b/Document/01_Official_NRDC_Application_Form.docx
@@ -136,7 +136,7 @@
                 <w:color w:val="0F172A"/>
                 <w:sz w:val="16"/>
               </w:rPr>
-              <w:t>1. Name of the Lead Applicant</w:t>
+              <w:t>1. Name of Applicant 1</w:t>
             </w:r>
           </w:p>
         </w:tc>
@@ -205,7 +205,7 @@
                 <w:color w:val="334155"/>
                 <w:sz w:val="16"/>
               </w:rPr>
-              <w:t>Lead Investigator &amp; Clinical Simulation Director, Department of General Surgery</w:t>
+              <w:t>Applicant 1 &amp; Clinical Simulation Director, Department of General Surgery</w:t>
             </w:r>
           </w:p>
         </w:tc>
@@ -371,7 +371,7 @@
                 <w:color w:val="0F172A"/>
                 <w:sz w:val="16"/>
               </w:rPr>
-              <w:t>2. Name of the Co-Applicant</w:t>
+              <w:t>2. Name of Applicant 2</w:t>
             </w:r>
           </w:p>
         </w:tc>
@@ -440,7 +440,7 @@
                 <w:color w:val="334155"/>
                 <w:sz w:val="16"/>
               </w:rPr>
-              <w:t>System Architect &amp; Lead Engineer, SurgiSkill AI Technical Team</w:t>
+              <w:t>Applicant 2 &amp; System Architect, SurgiSkill AI Technical Team</w:t>
             </w:r>
           </w:p>
         </w:tc>
@@ -581,7 +581,7 @@
                 <w:color w:val="334155"/>
                 <w:sz w:val="16"/>
               </w:rPr>
-              <w:t>Individual Academic Innovator / Clinical Research Team in collaboration with Engineering Lead</w:t>
+              <w:t>Academic Innovation Team — Applicant 1 (Clinical Lead) &amp; Applicant 2 (Engineering Lead)</w:t>
             </w:r>
           </w:p>
         </w:tc>
@@ -969,14 +969,14 @@
           </w:tcPr>
           <w:p>
             <w:r>
-              <w:t>Signature of Lead Applicant:</w:t>
+              <w:t>Signature of Applicant 1:</w:t>
               <w:br/>
               <w:br/>
               <w:t>___________________________________</w:t>
               <w:br/>
               <w:t>Dr. VIJAYANANDA</w:t>
               <w:br/>
-              <w:t>Lead Applicant &amp; Clinical Investigator</w:t>
+              <w:t>Applicant 1 &amp; Clinical Investigator</w:t>
               <w:br/>
               <w:t>Date: 11/10/2026</w:t>
             </w:r>
@@ -988,14 +988,14 @@
           </w:tcPr>
           <w:p>
             <w:r>
-              <w:t>Signature of Co-Applicant:</w:t>
+              <w:t>Signature of Applicant 2:</w:t>
               <w:br/>
               <w:br/>
               <w:t>___________________________________</w:t>
               <w:br/>
               <w:t>Armaan Samir Jena</w:t>
               <w:br/>
-              <w:t>Co-Applicant &amp; System Architect</w:t>
+              <w:t>Applicant 2 &amp; System Architect</w:t>
               <w:br/>
               <w:t>Date: 11/10/2026</w:t>
             </w:r>

</xml_diff>